<commit_message>
feat: nguon API (JSON) khong dung AI, bo lich luu file, timeout AI theo so dong, sua export Excel runner + tai lieu
- Nguon la API (JSON): tick o Buoc 1, ghep field voi khoa JSON bang code (src/api_source.py), chan dia chi noi bo
- Bo lich luu file: POST /schedules storage_mode=file tra 400, UI chi con luu DB (lich cu van chay)
- Timeout AI tinh them theo so dong ban ghi (bang day ngan van timeout truoc day)
- docs/runner.py export_results_excel: row read_result_single khong con thanh block thua
- Khung "Automation la gi" viet lai ky thuat; goi y {page} trong duong dan; workbook mau docs/samples
- BRD, TEST_GUIDE (them trang mau, ca API/bang, giai thich tung chuc nang Automation), CHANGELOG; 696 test dat

Co-Authored-By: Claude Sonnet 5 <noreply@anthropic.com>
</commit_message>
<xml_diff>
--- a/docs/BRD.docx
+++ b/docs/BRD.docx
@@ -283,7 +283,7 @@
           <w:color w:val="6B5A52"/>
           <w:sz w:val="21"/>
         </w:rPr>
-        <w:t xml:space="preserve"> = đã có code, có test tự động (676 test) và/hoặc đã kiểm chứng trên bản deploy; </w:t>
+        <w:t xml:space="preserve"> = đã có code, có test tự động (696 test) và/hoặc đã kiểm chứng trên bản deploy; </w:t>
       </w:r>
       <w:r>
         <w:rPr>
@@ -3329,7 +3329,23 @@
                 <w:b w:val="0"/>
                 <w:sz w:val="20"/>
               </w:rPr>
-              <w:t>Lên lịch chạy định kỳ (APScheduler); xem, sửa, xóa lịch</w:t>
+              <w:t xml:space="preserve">Lên lịch chạy định kỳ (APScheduler); xem, sửa, xóa lịch. Lịch </w:t>
+            </w:r>
+            <w:r>
+              <w:rPr>
+                <w:rFonts w:ascii="Calibri" w:hAnsi="Calibri" w:eastAsia="Calibri"/>
+                <w:b/>
+                <w:sz w:val="20"/>
+              </w:rPr>
+              <w:t>chỉ lưu vào DB</w:t>
+            </w:r>
+            <w:r>
+              <w:rPr>
+                <w:rFonts w:ascii="Calibri" w:hAnsi="Calibri" w:eastAsia="Calibri"/>
+                <w:b w:val="0"/>
+                <w:sz w:val="20"/>
+              </w:rPr>
+              <w:t>: lịch lưu ra file đã bỏ (file nằm trên server dùng chung, không phân quyền theo người dùng; muốn file thì xuất từ dataset) — lịch file đã tạo trước đây vẫn chạy</w:t>
             </w:r>
           </w:p>
         </w:tc>
@@ -3765,7 +3781,7 @@
                 <w:b w:val="0"/>
                 <w:sz w:val="20"/>
               </w:rPr>
-              <w:t>Đạt (đã đo hạn mức thật: qwen 2, GLM 5 request/phút; kiểm tra 429 thật)</w:t>
+              <w:t>Đạt (đã đo hạn mức thật: GLM-5.3-flash 5, qwen 2 request/phút; kiểm tra 429 thật)</w:t>
             </w:r>
           </w:p>
         </w:tc>
@@ -3869,7 +3885,23 @@
                 <w:b w:val="0"/>
                 <w:sz w:val="20"/>
               </w:rPr>
-              <w:t>Mỗi đoạn AI thử lại 1 lần khi lỗi, timeout tăng theo kích thước đoạn (đo thật: 60 bản ghi/đoạn đầy ~101 giây); một đoạn lỗi không làm hỏng cả trang; trang bị cắt bớt được báo rõ</w:t>
+              <w:t xml:space="preserve">Mỗi đoạn AI thử lại 1 lần khi lỗi, timeout tăng theo kích thước đoạn và </w:t>
+            </w:r>
+            <w:r>
+              <w:rPr>
+                <w:rFonts w:ascii="Calibri" w:hAnsi="Calibri" w:eastAsia="Calibri"/>
+                <w:b/>
+                <w:sz w:val="20"/>
+              </w:rPr>
+              <w:t>số dòng bản ghi</w:t>
+            </w:r>
+            <w:r>
+              <w:rPr>
+                <w:rFonts w:ascii="Calibri" w:hAnsi="Calibri" w:eastAsia="Calibri"/>
+                <w:b w:val="0"/>
+                <w:sz w:val="20"/>
+              </w:rPr>
+              <w:t xml:space="preserve"> (đo thật: 60 bản ghi/đoạn đầy ~101 giây; bảng 25 dòng chỉ 2,6 nghìn ký tự vẫn ~57 giây); một đoạn lỗi không làm hỏng cả trang; trang bị cắt bớt được báo rõ</w:t>
             </w:r>
           </w:p>
         </w:tc>
@@ -3902,6 +3934,100 @@
                 <w:sz w:val="20"/>
               </w:rPr>
               <w:t>Đạt</w:t>
+            </w:r>
+          </w:p>
+        </w:tc>
+      </w:tr>
+      <w:tr>
+        <w:tc>
+          <w:tcPr>
+            <w:tcW w:type="dxa" w:w="2493"/>
+            <w:shd w:val="clear" w:color="auto" w:fill="FFF1E8"/>
+          </w:tcPr>
+          <w:p>
+            <w:r/>
+            <w:r>
+              <w:rPr>
+                <w:rFonts w:ascii="Calibri" w:hAnsi="Calibri" w:eastAsia="Calibri"/>
+                <w:b w:val="0"/>
+                <w:sz w:val="20"/>
+              </w:rPr>
+              <w:t>FR-CR-26</w:t>
+            </w:r>
+          </w:p>
+        </w:tc>
+        <w:tc>
+          <w:tcPr>
+            <w:tcW w:type="dxa" w:w="2493"/>
+            <w:shd w:val="clear" w:color="auto" w:fill="FFF1E8"/>
+          </w:tcPr>
+          <w:p>
+            <w:r/>
+            <w:r>
+              <w:rPr>
+                <w:rFonts w:ascii="Calibri" w:hAnsi="Calibri" w:eastAsia="Calibri"/>
+                <w:b/>
+                <w:sz w:val="20"/>
+              </w:rPr>
+              <w:t>Nguồn là API (JSON)</w:t>
+            </w:r>
+            <w:r>
+              <w:rPr>
+                <w:rFonts w:ascii="Calibri" w:hAnsi="Calibri" w:eastAsia="Calibri"/>
+                <w:b w:val="0"/>
+                <w:sz w:val="20"/>
+              </w:rPr>
+              <w:t xml:space="preserve">: người dùng tick "Nguồn là API" và dán link API vào ô URL; hệ thống tải bằng HTTP (GET), tự tìm mảng bản ghi trong JSON, ghép tên field (hoặc mô tả) với khóa JSON, </w:t>
+            </w:r>
+            <w:r>
+              <w:rPr>
+                <w:rFonts w:ascii="Calibri" w:hAnsi="Calibri" w:eastAsia="Calibri"/>
+                <w:b/>
+                <w:sz w:val="20"/>
+              </w:rPr>
+              <w:t>không gọi AI</w:t>
+            </w:r>
+            <w:r>
+              <w:rPr>
+                <w:rFonts w:ascii="Calibri" w:hAnsi="Calibri" w:eastAsia="Calibri"/>
+                <w:b w:val="0"/>
+                <w:sz w:val="20"/>
+              </w:rPr>
+              <w:t>; báo rõ field không ghép được kèm danh sách khóa; chặn địa chỉ nội bộ; chưa hỗ trợ đặt lịch cho nguồn API</w:t>
+            </w:r>
+          </w:p>
+        </w:tc>
+        <w:tc>
+          <w:tcPr>
+            <w:tcW w:type="dxa" w:w="2493"/>
+            <w:shd w:val="clear" w:color="auto" w:fill="FFF1E8"/>
+          </w:tcPr>
+          <w:p>
+            <w:r/>
+            <w:r>
+              <w:rPr>
+                <w:rFonts w:ascii="Calibri" w:hAnsi="Calibri" w:eastAsia="Calibri"/>
+                <w:b w:val="0"/>
+                <w:sz w:val="20"/>
+              </w:rPr>
+              <w:t>Cao</w:t>
+            </w:r>
+          </w:p>
+        </w:tc>
+        <w:tc>
+          <w:tcPr>
+            <w:tcW w:type="dxa" w:w="2493"/>
+            <w:shd w:val="clear" w:color="auto" w:fill="FFF1E8"/>
+          </w:tcPr>
+          <w:p>
+            <w:r/>
+            <w:r>
+              <w:rPr>
+                <w:rFonts w:ascii="Calibri" w:hAnsi="Calibri" w:eastAsia="Calibri"/>
+                <w:b w:val="0"/>
+                <w:sz w:val="20"/>
+              </w:rPr>
+              <w:t>Đạt (đã chạy thật trên API công khai: 100 và 10 bản ghi, không gọi AI)</w:t>
             </w:r>
           </w:p>
         </w:tc>
@@ -6396,7 +6522,7 @@
                 <w:b w:val="0"/>
                 <w:sz w:val="20"/>
               </w:rPr>
-              <w:t>Bộ test tự động: 676 test đạt (unit, API, UI)</w:t>
+              <w:t>Bộ test tự động: 696 test đạt (unit, API, UI)</w:t>
             </w:r>
           </w:p>
         </w:tc>
@@ -7282,7 +7408,7 @@
                 <w:b w:val="0"/>
                 <w:sz w:val="20"/>
               </w:rPr>
-              <w:t xml:space="preserve"> (qwen 2/phút, dùng chung cho crawl, phản hồi AI và Runner AI cùng một key) → nhiều người crawl cùng lúc sẽ phải xếp hàng (thanh tiến độ báo "chờ hạn mức"); giảm nhẹ bằng chọn model có hạn mức cao hơn (GLM 5/phút, nhanh hơn ~2,2 lần trong bài đo) sau khi kiểm tra chất lượng trên trang thật, hoặc xin BTC nâng hạn mức</w:t>
+              <w:t xml:space="preserve"> (model đang dùng GLM-5.3-flash: 5/phút; qwen chỉ 2/phút; dùng chung cho crawl, phản hồi AI và Runner AI cùng một key) → nhiều người crawl cùng lúc sẽ phải xếp hàng (thanh tiến độ báo "chờ hạn mức"); đã chuyển từ qwen sang GLM-5.3-flash theo khuyến nghị của BTC (nhanh hơn ~2,2 lần trong bài đo); còn phải kiểm tra chất lượng GLM trên trang thật, hoặc xin BTC nâng hạn mức</w:t>
             </w:r>
           </w:p>
         </w:tc>
@@ -7970,7 +8096,7 @@
           <w:b w:val="0"/>
           <w:sz w:val="22"/>
         </w:rPr>
-        <w:t xml:space="preserve"> đo chất lượng trích xuất với model AI thật (Qwen3.6-Flash, GLM-5.2); UAT Automation với trang và trình duyệt thật; đóng gói agent cho người không cài Python; tắt DB Public/bật SSL; dọn runtime thừa.</w:t>
+        <w:t xml:space="preserve"> đo chất lượng trích xuất với model AI thật (GLM-5.3-flash, Gemma); UAT Automation với trang và trình duyệt thật; đóng gói agent cho người không cài Python; tắt DB Public/bật SSL; dọn runtime thừa.</w:t>
       </w:r>
     </w:p>
     <w:p>
@@ -8459,7 +8585,7 @@
         <w:color w:val="6B5A52"/>
         <w:sz w:val="18"/>
       </w:rPr>
-      <w:t>BRD — Web Data Puller (MSB Team 56)</w:t>
+      <w:t>BRD — Web Data Puller</w:t>
     </w:r>
   </w:p>
 </w:hdr>

</xml_diff>

<commit_message>
fix: nguon API luon dung engine httpx (static_fetcher) vi Playwright boc JSON trong the HTML; 697 test
Co-Authored-By: Claude Sonnet 5 <noreply@anthropic.com>
</commit_message>
<xml_diff>
--- a/docs/BRD.docx
+++ b/docs/BRD.docx
@@ -283,7 +283,7 @@
           <w:color w:val="6B5A52"/>
           <w:sz w:val="21"/>
         </w:rPr>
-        <w:t xml:space="preserve"> = đã có code, có test tự động (696 test) và/hoặc đã kiểm chứng trên bản deploy; </w:t>
+        <w:t xml:space="preserve"> = đã có code, có test tự động (697 test) và/hoặc đã kiểm chứng trên bản deploy; </w:t>
       </w:r>
       <w:r>
         <w:rPr>
@@ -6522,7 +6522,7 @@
                 <w:b w:val="0"/>
                 <w:sz w:val="20"/>
               </w:rPr>
-              <w:t>Bộ test tự động: 696 test đạt (unit, API, UI)</w:t>
+              <w:t>Bộ test tự động: 697 test đạt (unit, API, UI)</w:t>
             </w:r>
           </w:p>
         </w:tc>

</xml_diff>

<commit_message>
feat(automation): bao loi va goi y sua cho run loi (goi y co dinh theo ma preflight + AI chi nhan metadata), tab admin Run loi; 714 test
Co-Authored-By: Claude Sonnet 5 <noreply@anthropic.com>
</commit_message>
<xml_diff>
--- a/docs/BRD.docx
+++ b/docs/BRD.docx
@@ -283,7 +283,7 @@
           <w:color w:val="6B5A52"/>
           <w:sz w:val="21"/>
         </w:rPr>
-        <w:t xml:space="preserve"> = đã có code, có test tự động (697 test) và/hoặc đã kiểm chứng trên bản deploy; </w:t>
+        <w:t xml:space="preserve"> = đã có code, có test tự động (714 test) và/hoặc đã kiểm chứng trên bản deploy; </w:t>
       </w:r>
       <w:r>
         <w:rPr>
@@ -1823,7 +1823,7 @@
                 <w:b w:val="0"/>
                 <w:sz w:val="20"/>
               </w:rPr>
-              <w:t>FR-AD-01..06</w:t>
+              <w:t>FR-AD-01..07</w:t>
             </w:r>
           </w:p>
         </w:tc>
@@ -4981,6 +4981,116 @@
           </w:p>
         </w:tc>
       </w:tr>
+      <w:tr>
+        <w:tc>
+          <w:tcPr>
+            <w:tcW w:type="dxa" w:w="2493"/>
+            <w:shd w:val="clear" w:color="auto" w:fill="FFF1E8"/>
+          </w:tcPr>
+          <w:p>
+            <w:r/>
+            <w:r>
+              <w:rPr>
+                <w:rFonts w:ascii="Calibri" w:hAnsi="Calibri" w:eastAsia="Calibri"/>
+                <w:b w:val="0"/>
+                <w:sz w:val="20"/>
+              </w:rPr>
+              <w:t>FR-AU-12</w:t>
+            </w:r>
+          </w:p>
+        </w:tc>
+        <w:tc>
+          <w:tcPr>
+            <w:tcW w:type="dxa" w:w="2493"/>
+            <w:shd w:val="clear" w:color="auto" w:fill="FFF1E8"/>
+          </w:tcPr>
+          <w:p>
+            <w:r/>
+            <w:r>
+              <w:rPr>
+                <w:rFonts w:ascii="Calibri" w:hAnsi="Calibri" w:eastAsia="Calibri"/>
+                <w:b/>
+                <w:sz w:val="20"/>
+              </w:rPr>
+              <w:t>Báo lỗi và gợi ý sửa run lỗi</w:t>
+            </w:r>
+            <w:r>
+              <w:rPr>
+                <w:rFonts w:ascii="Calibri" w:hAnsi="Calibri" w:eastAsia="Calibri"/>
+                <w:b w:val="0"/>
+                <w:sz w:val="20"/>
+              </w:rPr>
+              <w:t xml:space="preserve"> (như Crawl): run FAILED / ERROR / UNVERIFIED / LOST hoặc bị chặn ở preflight có nút </w:t>
+            </w:r>
+            <w:r>
+              <w:rPr>
+                <w:rFonts w:ascii="Calibri" w:hAnsi="Calibri" w:eastAsia="Calibri"/>
+                <w:b/>
+                <w:sz w:val="20"/>
+              </w:rPr>
+              <w:t>Gợi ý sửa</w:t>
+            </w:r>
+            <w:r>
+              <w:rPr>
+                <w:rFonts w:ascii="Calibri" w:hAnsi="Calibri" w:eastAsia="Calibri"/>
+                <w:b w:val="0"/>
+                <w:sz w:val="20"/>
+              </w:rPr>
+              <w:t xml:space="preserve"> (gợi ý cố định theo từng mã lỗi kiểm tra tĩnh, kèm gợi ý từ AI nếu bật) và </w:t>
+            </w:r>
+            <w:r>
+              <w:rPr>
+                <w:rFonts w:ascii="Calibri" w:hAnsi="Calibri" w:eastAsia="Calibri"/>
+                <w:b/>
+                <w:sz w:val="20"/>
+              </w:rPr>
+              <w:t>Báo lỗi cho admin</w:t>
+            </w:r>
+            <w:r>
+              <w:rPr>
+                <w:rFonts w:ascii="Calibri" w:hAnsi="Calibri" w:eastAsia="Calibri"/>
+                <w:b w:val="0"/>
+                <w:sz w:val="20"/>
+              </w:rPr>
+              <w:t xml:space="preserve"> (kèm ghi chú đã che bí mật). AI và admin chỉ thấy metadata (trạng thái, số ca, mã lỗi, sheet, dòng), không thấy dữ liệu workbook; tối đa 5 lần gợi ý mỗi phút mỗi người; AI không tự sửa hay chạy lại</w:t>
+            </w:r>
+          </w:p>
+        </w:tc>
+        <w:tc>
+          <w:tcPr>
+            <w:tcW w:type="dxa" w:w="2493"/>
+            <w:shd w:val="clear" w:color="auto" w:fill="FFF1E8"/>
+          </w:tcPr>
+          <w:p>
+            <w:r/>
+            <w:r>
+              <w:rPr>
+                <w:rFonts w:ascii="Calibri" w:hAnsi="Calibri" w:eastAsia="Calibri"/>
+                <w:b w:val="0"/>
+                <w:sz w:val="20"/>
+              </w:rPr>
+              <w:t>Trung bình</w:t>
+            </w:r>
+          </w:p>
+        </w:tc>
+        <w:tc>
+          <w:tcPr>
+            <w:tcW w:type="dxa" w:w="2493"/>
+            <w:shd w:val="clear" w:color="auto" w:fill="FFF1E8"/>
+          </w:tcPr>
+          <w:p>
+            <w:r/>
+            <w:r>
+              <w:rPr>
+                <w:rFonts w:ascii="Calibri" w:hAnsi="Calibri" w:eastAsia="Calibri"/>
+                <w:b w:val="0"/>
+                <w:sz w:val="20"/>
+              </w:rPr>
+              <w:t>Đạt (offline: kiểm thử tự động; chưa thử với AI thật)</w:t>
+            </w:r>
+          </w:p>
+        </w:tc>
+      </w:tr>
     </w:tbl>
     <w:p/>
     <w:p>
@@ -5512,6 +5622,88 @@
           </w:p>
         </w:tc>
       </w:tr>
+      <w:tr>
+        <w:tc>
+          <w:tcPr>
+            <w:tcW w:type="dxa" w:w="2493"/>
+          </w:tcPr>
+          <w:p>
+            <w:r/>
+            <w:r>
+              <w:rPr>
+                <w:rFonts w:ascii="Calibri" w:hAnsi="Calibri" w:eastAsia="Calibri"/>
+                <w:b w:val="0"/>
+                <w:sz w:val="20"/>
+              </w:rPr>
+              <w:t>FR-AD-07</w:t>
+            </w:r>
+          </w:p>
+        </w:tc>
+        <w:tc>
+          <w:tcPr>
+            <w:tcW w:type="dxa" w:w="2493"/>
+          </w:tcPr>
+          <w:p>
+            <w:r/>
+            <w:r>
+              <w:rPr>
+                <w:rFonts w:ascii="Calibri" w:hAnsi="Calibri" w:eastAsia="Calibri"/>
+                <w:b w:val="0"/>
+                <w:sz w:val="20"/>
+              </w:rPr>
+              <w:t xml:space="preserve">Tab </w:t>
+            </w:r>
+            <w:r>
+              <w:rPr>
+                <w:rFonts w:ascii="Calibri" w:hAnsi="Calibri" w:eastAsia="Calibri"/>
+                <w:b/>
+                <w:sz w:val="20"/>
+              </w:rPr>
+              <w:t>Automation · Run lỗi &amp; gợi ý sửa</w:t>
+            </w:r>
+            <w:r>
+              <w:rPr>
+                <w:rFonts w:ascii="Calibri" w:hAnsi="Calibri" w:eastAsia="Calibri"/>
+                <w:b w:val="0"/>
+                <w:sz w:val="20"/>
+              </w:rPr>
+              <w:t>: xem báo lỗi run của người dùng và các run cần chú ý, hỏi AI gợi ý sửa (chỉ đọc)</w:t>
+            </w:r>
+          </w:p>
+        </w:tc>
+        <w:tc>
+          <w:tcPr>
+            <w:tcW w:type="dxa" w:w="2493"/>
+          </w:tcPr>
+          <w:p>
+            <w:r/>
+            <w:r>
+              <w:rPr>
+                <w:rFonts w:ascii="Calibri" w:hAnsi="Calibri" w:eastAsia="Calibri"/>
+                <w:b w:val="0"/>
+                <w:sz w:val="20"/>
+              </w:rPr>
+              <w:t>Trung bình</w:t>
+            </w:r>
+          </w:p>
+        </w:tc>
+        <w:tc>
+          <w:tcPr>
+            <w:tcW w:type="dxa" w:w="2493"/>
+          </w:tcPr>
+          <w:p>
+            <w:r/>
+            <w:r>
+              <w:rPr>
+                <w:rFonts w:ascii="Calibri" w:hAnsi="Calibri" w:eastAsia="Calibri"/>
+                <w:b w:val="0"/>
+                <w:sz w:val="20"/>
+              </w:rPr>
+              <w:t>Đạt (offline)</w:t>
+            </w:r>
+          </w:p>
+        </w:tc>
+      </w:tr>
     </w:tbl>
     <w:p/>
     <w:p>
@@ -6522,7 +6714,7 @@
                 <w:b w:val="0"/>
                 <w:sz w:val="20"/>
               </w:rPr>
-              <w:t>Bộ test tự động: 697 test đạt (unit, API, UI)</w:t>
+              <w:t>Bộ test tự động: 714 test đạt (unit, API, UI)</w:t>
             </w:r>
           </w:p>
         </w:tc>

</xml_diff>